<commit_message>
update Appendix instructions, move methods to after OSD.
</commit_message>
<xml_diff>
--- a/PR_Article.docx
+++ b/PR_Article.docx
@@ -2414,7 +2414,7 @@
       </w:pPr>
       <w:r>
         <w:rPr/>
-        <w:t>Appendices are optional sections. Each table or figure in an appendix should be labeled starting with the corresponding appendix letter (e.g., Table A1). Note that letters do not contain appendices.</w:t>
+        <w:t>Appendices are optional sections that follow the open science statements. All figures and tables in the appendix must be referenced in the text of the appendix. Figure, table, and equation numbers should be prefixed by the appendix letter (such as Figure A1). Note that letters do not contain appendices.</w:t>
       </w:r>
     </w:p>
     <w:p>
@@ -4743,8 +4743,8 @@
       <w:bCs/>
     </w:rPr>
   </w:style>
-  <w:style w:type="paragraph" w:styleId="FrameContents">
-    <w:name w:val="Frame Contents"/>
+  <w:style w:type="paragraph" w:styleId="FrameContentsuser">
+    <w:name w:val="Frame Contents (user)"/>
     <w:basedOn w:val="Normal"/>
     <w:qFormat/>
     <w:pPr/>

</xml_diff>